<commit_message>
Update Assign task screenshot
</commit_message>
<xml_diff>
--- a/documents/team-b/UX/Core-MVP-Detailed-Wireframes.docx
+++ b/documents/team-b/UX/Core-MVP-Detailed-Wireframes.docx
@@ -110,6 +110,63 @@
     </w:p>
     <w:p>
       <w:pPr>
+        <w:spacing w:after="40"/>
+      </w:pPr>
+      <w:r>
+        <w:rPr>
+          <w:rFonts w:ascii="Calibri" w:eastAsia="Calibri" w:hAnsi="Calibri" w:cs="Calibri"/>
+          <w:b/>
+          <w:bCs/>
+        </w:rPr>
+        <w:t xml:space="preserve">Source requirements: </w:t>
+      </w:r>
+      <w:r>
+        <w:rPr>
+          <w:rFonts w:ascii="Calibri" w:eastAsia="Calibri" w:hAnsi="Calibri" w:cs="Calibri"/>
+        </w:rPr>
+        <w:t>Team40_TeamB_Core_MVP_User_Stories_Acceptance_Criteria_Shakthijhaa_S4065078.docx; Team40_TeamB_Applicant-to-Intern_Transition_Requirements_Shakthijhaa_S4065078.docx (Week 2 BA update — supersedes the original BA doc used for Early Wireframes)</w:t>
+      </w:r>
+    </w:p>
+    <w:p>
+      <w:pPr>
+        <w:spacing w:after="40"/>
+      </w:pPr>
+      <w:r>
+        <w:rPr>
+          <w:rFonts w:ascii="Calibri" w:eastAsia="Calibri" w:hAnsi="Calibri" w:cs="Calibri"/>
+          <w:b/>
+          <w:bCs/>
+        </w:rPr>
+        <w:t xml:space="preserve">PM direction: </w:t>
+      </w:r>
+      <w:r>
+        <w:rPr>
+          <w:rFonts w:ascii="Calibri" w:eastAsia="Calibri" w:hAnsi="Calibri" w:cs="Calibri"/>
+        </w:rPr>
+        <w:t>Jianqi Lu, Discord, screen/flow structure and field confirmations</w:t>
+      </w:r>
+    </w:p>
+    <w:p>
+      <w:pPr>
+        <w:spacing w:after="40"/>
+      </w:pPr>
+      <w:r>
+        <w:rPr>
+          <w:rFonts w:ascii="Calibri" w:eastAsia="Calibri" w:hAnsi="Calibri" w:cs="Calibri"/>
+          <w:b/>
+          <w:bCs/>
+        </w:rPr>
+        <w:t xml:space="preserve">BA review: </w:t>
+      </w:r>
+      <w:r>
+        <w:rPr>
+          <w:rFonts w:ascii="Calibri" w:eastAsia="Calibri" w:hAnsi="Calibri" w:cs="Calibri"/>
+        </w:rPr>
+        <w:t>Approved by Shakthijhaa Sivagnanam, subject to 2 traceability corrections — see Section 6.1</w:t>
+      </w:r>
+    </w:p>
+    <w:p>
+      <w:pPr>
         <w:pStyle w:val="Heading1"/>
         <w:spacing w:before="320" w:after="160"/>
       </w:pPr>
@@ -156,7 +213,7 @@
         <w:pStyle w:val="ListParagraph"/>
         <w:numPr>
           <w:ilvl w:val="0"/>
-          <w:numId w:val="1"/>
+          <w:numId w:val="2"/>
         </w:numPr>
         <w:spacing w:after="80"/>
       </w:pPr>
@@ -174,7 +231,7 @@
         <w:pStyle w:val="ListParagraph"/>
         <w:numPr>
           <w:ilvl w:val="0"/>
-          <w:numId w:val="1"/>
+          <w:numId w:val="2"/>
         </w:numPr>
         <w:spacing w:after="80"/>
       </w:pPr>
@@ -184,7 +241,7 @@
           <w:sz w:val="22"/>
           <w:szCs w:val="22"/>
         </w:rPr>
-        <w:t>Mentor Task Assignment gains a Due Date field and drops the status selector entirely (WA-08).</w:t>
+        <w:t>Mentor Task Assignment gains a Due Date field and drops the status selector entirely (FR-02, FR-03).</w:t>
       </w:r>
     </w:p>
     <w:p>
@@ -192,7 +249,7 @@
         <w:pStyle w:val="ListParagraph"/>
         <w:numPr>
           <w:ilvl w:val="0"/>
-          <w:numId w:val="1"/>
+          <w:numId w:val="2"/>
         </w:numPr>
         <w:spacing w:after="80"/>
       </w:pPr>
@@ -210,7 +267,7 @@
         <w:pStyle w:val="ListParagraph"/>
         <w:numPr>
           <w:ilvl w:val="0"/>
-          <w:numId w:val="1"/>
+          <w:numId w:val="2"/>
         </w:numPr>
         <w:spacing w:after="80"/>
       </w:pPr>
@@ -253,7 +310,7 @@
           <w:left w:w="10" w:type="dxa"/>
           <w:right w:w="10" w:type="dxa"/>
         </w:tblCellMar>
-        <w:tblLook w:val="04A0" w:firstRow="1" w:lastRow="0" w:firstColumn="1" w:lastColumn="0" w:noHBand="0" w:noVBand="1"/>
+        <w:tblLook w:val="0000" w:firstRow="0" w:lastRow="0" w:firstColumn="0" w:lastColumn="0" w:noHBand="0" w:noVBand="0"/>
       </w:tblPr>
       <w:tblGrid>
         <w:gridCol w:w="2600"/>
@@ -769,6 +826,7 @@
               <w:rPr>
                 <w:rFonts w:ascii="Calibri" w:eastAsia="Calibri" w:hAnsi="Calibri" w:cs="Calibri"/>
               </w:rPr>
+              <w:lastRenderedPageBreak/>
               <w:t>Review progress — no submission</w:t>
             </w:r>
           </w:p>
@@ -855,7 +913,7 @@
         <w:pStyle w:val="ListParagraph"/>
         <w:numPr>
           <w:ilvl w:val="0"/>
-          <w:numId w:val="1"/>
+          <w:numId w:val="2"/>
         </w:numPr>
         <w:spacing w:after="80"/>
       </w:pPr>
@@ -873,7 +931,7 @@
         <w:pStyle w:val="ListParagraph"/>
         <w:numPr>
           <w:ilvl w:val="0"/>
-          <w:numId w:val="1"/>
+          <w:numId w:val="2"/>
         </w:numPr>
         <w:spacing w:after="80"/>
       </w:pPr>
@@ -906,7 +964,7 @@
         <w:pStyle w:val="ListParagraph"/>
         <w:numPr>
           <w:ilvl w:val="0"/>
-          <w:numId w:val="1"/>
+          <w:numId w:val="2"/>
         </w:numPr>
         <w:spacing w:after="80"/>
       </w:pPr>
@@ -924,7 +982,7 @@
         <w:pStyle w:val="ListParagraph"/>
         <w:numPr>
           <w:ilvl w:val="0"/>
-          <w:numId w:val="1"/>
+          <w:numId w:val="2"/>
         </w:numPr>
         <w:spacing w:after="80"/>
       </w:pPr>
@@ -957,7 +1015,7 @@
         <w:pStyle w:val="ListParagraph"/>
         <w:numPr>
           <w:ilvl w:val="0"/>
-          <w:numId w:val="1"/>
+          <w:numId w:val="2"/>
         </w:numPr>
         <w:spacing w:after="80"/>
       </w:pPr>
@@ -990,7 +1048,7 @@
         <w:pStyle w:val="ListParagraph"/>
         <w:numPr>
           <w:ilvl w:val="0"/>
-          <w:numId w:val="1"/>
+          <w:numId w:val="2"/>
         </w:numPr>
         <w:spacing w:after="80"/>
       </w:pPr>
@@ -1000,25 +1058,7 @@
           <w:sz w:val="22"/>
           <w:szCs w:val="22"/>
         </w:rPr>
-        <w:t xml:space="preserve">Status control is forward-only: the button label changes based on </w:t>
-      </w:r>
-      <w:proofErr w:type="gramStart"/>
-      <w:r>
-        <w:rPr>
-          <w:rFonts w:ascii="Calibri" w:eastAsia="Calibri" w:hAnsi="Calibri" w:cs="Calibri"/>
-          <w:sz w:val="22"/>
-          <w:szCs w:val="22"/>
-        </w:rPr>
-        <w:t>current status</w:t>
-      </w:r>
-      <w:proofErr w:type="gramEnd"/>
-      <w:r>
-        <w:rPr>
-          <w:rFonts w:ascii="Calibri" w:eastAsia="Calibri" w:hAnsi="Calibri" w:cs="Calibri"/>
-          <w:sz w:val="22"/>
-          <w:szCs w:val="22"/>
-        </w:rPr>
-        <w:t xml:space="preserve"> (“Start task” → In Progress, “Mark completed” → Completed), so an invalid status value (EC-05) cannot be entered through the UI at all</w:t>
+        <w:t>Status control is forward-only: the button label changes based on current status (“Start task” → In Progress, “Mark completed” → Completed), so an invalid status value (EC-05) cannot be entered through the UI at all</w:t>
       </w:r>
     </w:p>
     <w:p>
@@ -1026,7 +1066,7 @@
         <w:pStyle w:val="ListParagraph"/>
         <w:numPr>
           <w:ilvl w:val="0"/>
-          <w:numId w:val="1"/>
+          <w:numId w:val="2"/>
         </w:numPr>
         <w:spacing w:after="80"/>
       </w:pPr>
@@ -1036,25 +1076,7 @@
           <w:sz w:val="22"/>
           <w:szCs w:val="22"/>
         </w:rPr>
-        <w:t xml:space="preserve">Task Submission is a collapsible section on this same screen, not a separate page — kept generic (no </w:t>
-      </w:r>
-      <w:proofErr w:type="spellStart"/>
-      <w:r>
-        <w:rPr>
-          <w:rFonts w:ascii="Calibri" w:eastAsia="Calibri" w:hAnsi="Calibri" w:cs="Calibri"/>
-          <w:sz w:val="22"/>
-          <w:szCs w:val="22"/>
-        </w:rPr>
-        <w:t>labeled</w:t>
-      </w:r>
-      <w:proofErr w:type="spellEnd"/>
-      <w:r>
-        <w:rPr>
-          <w:rFonts w:ascii="Calibri" w:eastAsia="Calibri" w:hAnsi="Calibri" w:cs="Calibri"/>
-          <w:sz w:val="22"/>
-          <w:szCs w:val="22"/>
-        </w:rPr>
-        <w:t xml:space="preserve"> fields) because content is unconfirmed (OR-03 / EC-07 / AC-03.5)</w:t>
+        <w:t>Task Submission is a collapsible section on this same screen, not a separate page — kept generic (no labeled fields) because content is unconfirmed (OR-03 / EC-07 / AC-03.5)</w:t>
       </w:r>
     </w:p>
     <w:p>
@@ -1062,7 +1084,7 @@
         <w:pStyle w:val="ListParagraph"/>
         <w:numPr>
           <w:ilvl w:val="0"/>
-          <w:numId w:val="1"/>
+          <w:numId w:val="2"/>
         </w:numPr>
         <w:spacing w:after="80"/>
       </w:pPr>
@@ -1095,7 +1117,7 @@
         <w:pStyle w:val="ListParagraph"/>
         <w:numPr>
           <w:ilvl w:val="0"/>
-          <w:numId w:val="1"/>
+          <w:numId w:val="2"/>
         </w:numPr>
         <w:spacing w:after="80"/>
       </w:pPr>
@@ -1113,7 +1135,7 @@
         <w:pStyle w:val="ListParagraph"/>
         <w:numPr>
           <w:ilvl w:val="0"/>
-          <w:numId w:val="1"/>
+          <w:numId w:val="2"/>
         </w:numPr>
         <w:spacing w:after="80"/>
       </w:pPr>
@@ -1131,7 +1153,7 @@
         <w:pStyle w:val="ListParagraph"/>
         <w:numPr>
           <w:ilvl w:val="0"/>
-          <w:numId w:val="1"/>
+          <w:numId w:val="2"/>
         </w:numPr>
         <w:spacing w:after="80"/>
       </w:pPr>
@@ -1164,7 +1186,7 @@
         <w:pStyle w:val="ListParagraph"/>
         <w:numPr>
           <w:ilvl w:val="0"/>
-          <w:numId w:val="1"/>
+          <w:numId w:val="2"/>
         </w:numPr>
         <w:spacing w:after="80"/>
       </w:pPr>
@@ -1174,7 +1196,7 @@
           <w:sz w:val="22"/>
           <w:szCs w:val="22"/>
         </w:rPr>
-        <w:t>Fields: Task Title, Description, Due Date, Assigned Intern — per WA-08</w:t>
+        <w:t>Fields: Task Title, Description, Due Date, Assigned Intern — per FR-02. No manual status selection required of the Mentor (FR-02, FR-03)</w:t>
       </w:r>
     </w:p>
     <w:p>
@@ -1182,7 +1204,7 @@
         <w:pStyle w:val="ListParagraph"/>
         <w:numPr>
           <w:ilvl w:val="0"/>
-          <w:numId w:val="1"/>
+          <w:numId w:val="2"/>
         </w:numPr>
         <w:spacing w:after="80"/>
       </w:pPr>
@@ -1207,6 +1229,7 @@
           <w:bCs/>
           <w:color w:val="1B3A5C"/>
         </w:rPr>
+        <w:lastRenderedPageBreak/>
         <w:t>4.7 Review progress — US-05 / FR-16–18 / AC-05.1 (Mentor)</w:t>
       </w:r>
     </w:p>
@@ -1215,7 +1238,7 @@
         <w:pStyle w:val="ListParagraph"/>
         <w:numPr>
           <w:ilvl w:val="0"/>
-          <w:numId w:val="1"/>
+          <w:numId w:val="2"/>
         </w:numPr>
         <w:spacing w:after="80"/>
       </w:pPr>
@@ -1225,7 +1248,6 @@
           <w:sz w:val="22"/>
           <w:szCs w:val="22"/>
         </w:rPr>
-        <w:lastRenderedPageBreak/>
         <w:t>Read-only, per-intern, unchanged in spirit from the Early Wireframes version</w:t>
       </w:r>
     </w:p>
@@ -1249,7 +1271,7 @@
         <w:pStyle w:val="ListParagraph"/>
         <w:numPr>
           <w:ilvl w:val="0"/>
-          <w:numId w:val="1"/>
+          <w:numId w:val="2"/>
         </w:numPr>
         <w:spacing w:after="80"/>
       </w:pPr>
@@ -1282,7 +1304,7 @@
         <w:pStyle w:val="ListParagraph"/>
         <w:numPr>
           <w:ilvl w:val="0"/>
-          <w:numId w:val="1"/>
+          <w:numId w:val="2"/>
         </w:numPr>
         <w:spacing w:after="80"/>
       </w:pPr>
@@ -1300,7 +1322,7 @@
         <w:pStyle w:val="ListParagraph"/>
         <w:numPr>
           <w:ilvl w:val="0"/>
-          <w:numId w:val="1"/>
+          <w:numId w:val="2"/>
         </w:numPr>
         <w:spacing w:after="80"/>
       </w:pPr>
@@ -1318,7 +1340,7 @@
         <w:pStyle w:val="ListParagraph"/>
         <w:numPr>
           <w:ilvl w:val="0"/>
-          <w:numId w:val="1"/>
+          <w:numId w:val="2"/>
         </w:numPr>
         <w:spacing w:after="80"/>
       </w:pPr>
@@ -1336,7 +1358,7 @@
         <w:pStyle w:val="ListParagraph"/>
         <w:numPr>
           <w:ilvl w:val="0"/>
-          <w:numId w:val="1"/>
+          <w:numId w:val="2"/>
         </w:numPr>
         <w:spacing w:after="80"/>
       </w:pPr>
@@ -1417,99 +1439,63 @@
           <w:sz w:val="22"/>
           <w:szCs w:val="22"/>
         </w:rPr>
-        <w:t xml:space="preserve">Required fields marked with both an asterisk and (in build) an accessible label. Every state </w:t>
-      </w:r>
-      <w:proofErr w:type="gramStart"/>
+        <w:t>Required fields marked with both an asterisk and (in build) an accessible label. Every state pairs an icon/border treatment with a text label rather than color alone.</w:t>
+      </w:r>
+    </w:p>
+    <w:p>
+      <w:pPr>
+        <w:pStyle w:val="Heading2"/>
+        <w:spacing w:before="320" w:after="160"/>
+      </w:pPr>
+      <w:r>
+        <w:rPr>
+          <w:rFonts w:ascii="Calibri" w:eastAsia="Calibri" w:hAnsi="Calibri" w:cs="Calibri"/>
+          <w:b/>
+          <w:bCs/>
+          <w:color w:val="1B3A5C"/>
+        </w:rPr>
+        <w:t>Existing design system / shared IMS direction</w:t>
+      </w:r>
+    </w:p>
+    <w:p>
+      <w:pPr>
+        <w:spacing w:after="160"/>
+      </w:pPr>
       <w:r>
         <w:rPr>
           <w:rFonts w:ascii="Calibri" w:eastAsia="Calibri" w:hAnsi="Calibri" w:cs="Calibri"/>
           <w:sz w:val="22"/>
           <w:szCs w:val="22"/>
         </w:rPr>
-        <w:t>pairs</w:t>
-      </w:r>
-      <w:proofErr w:type="gramEnd"/>
+        <w:t>Follows the same grayscale wireframe convention as the Early Wireframes deliverable. Per the PM's Discord direction, the landing page, login, navigation, and account/profile experience are shared touchpoints with Team A and are explicitly not designed in this file — see Section 7.</w:t>
+      </w:r>
+    </w:p>
+    <w:p>
+      <w:pPr>
+        <w:pStyle w:val="Heading1"/>
+        <w:spacing w:before="320" w:after="160"/>
+      </w:pPr>
+      <w:r>
+        <w:rPr>
+          <w:rFonts w:ascii="Calibri" w:eastAsia="Calibri" w:hAnsi="Calibri" w:cs="Calibri"/>
+          <w:b/>
+          <w:bCs/>
+          <w:color w:val="1B3A5C"/>
+        </w:rPr>
+        <w:t>6. Working assumptions incorporated</w:t>
+      </w:r>
+    </w:p>
+    <w:p>
+      <w:pPr>
+        <w:spacing w:after="160"/>
+      </w:pPr>
       <w:r>
         <w:rPr>
           <w:rFonts w:ascii="Calibri" w:eastAsia="Calibri" w:hAnsi="Calibri" w:cs="Calibri"/>
           <w:sz w:val="22"/>
           <w:szCs w:val="22"/>
         </w:rPr>
-        <w:t xml:space="preserve"> an icon/border treatment with a text label rather than </w:t>
-      </w:r>
-      <w:proofErr w:type="spellStart"/>
-      <w:r>
-        <w:rPr>
-          <w:rFonts w:ascii="Calibri" w:eastAsia="Calibri" w:hAnsi="Calibri" w:cs="Calibri"/>
-          <w:sz w:val="22"/>
-          <w:szCs w:val="22"/>
-        </w:rPr>
-        <w:t>color</w:t>
-      </w:r>
-      <w:proofErr w:type="spellEnd"/>
-      <w:r>
-        <w:rPr>
-          <w:rFonts w:ascii="Calibri" w:eastAsia="Calibri" w:hAnsi="Calibri" w:cs="Calibri"/>
-          <w:sz w:val="22"/>
-          <w:szCs w:val="22"/>
-        </w:rPr>
-        <w:t xml:space="preserve"> alone.</w:t>
-      </w:r>
-    </w:p>
-    <w:p>
-      <w:pPr>
-        <w:pStyle w:val="Heading2"/>
-        <w:spacing w:before="320" w:after="160"/>
-      </w:pPr>
-      <w:r>
-        <w:rPr>
-          <w:rFonts w:ascii="Calibri" w:eastAsia="Calibri" w:hAnsi="Calibri" w:cs="Calibri"/>
-          <w:b/>
-          <w:bCs/>
-          <w:color w:val="1B3A5C"/>
-        </w:rPr>
-        <w:t>Existing design system / shared IMS direction</w:t>
-      </w:r>
-    </w:p>
-    <w:p>
-      <w:pPr>
-        <w:spacing w:after="160"/>
-      </w:pPr>
-      <w:r>
-        <w:rPr>
-          <w:rFonts w:ascii="Calibri" w:eastAsia="Calibri" w:hAnsi="Calibri" w:cs="Calibri"/>
-          <w:sz w:val="22"/>
-          <w:szCs w:val="22"/>
-        </w:rPr>
-        <w:t>Follows the same grayscale wireframe convention as the Early Wireframes deliverable. Per the PM's Discord direction, the landing page, login, navigation, and account/profile experience are shared touchpoints with Team A and are explicitly not designed in this file — see Section 7.</w:t>
-      </w:r>
-    </w:p>
-    <w:p>
-      <w:pPr>
-        <w:pStyle w:val="Heading1"/>
-        <w:spacing w:before="320" w:after="160"/>
-      </w:pPr>
-      <w:r>
-        <w:rPr>
-          <w:rFonts w:ascii="Calibri" w:eastAsia="Calibri" w:hAnsi="Calibri" w:cs="Calibri"/>
-          <w:b/>
-          <w:bCs/>
-          <w:color w:val="1B3A5C"/>
-        </w:rPr>
-        <w:t>6. Working assumptions incorporated</w:t>
-      </w:r>
-    </w:p>
-    <w:p>
-      <w:pPr>
-        <w:spacing w:after="160"/>
-      </w:pPr>
-      <w:r>
-        <w:rPr>
-          <w:rFonts w:ascii="Calibri" w:eastAsia="Calibri" w:hAnsi="Calibri" w:cs="Calibri"/>
-          <w:sz w:val="22"/>
-          <w:szCs w:val="22"/>
-        </w:rPr>
-        <w:t>Every screen is annotated with the specific WA/OR/EC code it depends on, rather than treating the BA's working assumptions as implicit. Two points worth flagging explicitly:</w:t>
+        <w:t>Every screen is annotated with the specific WA/OR/EC code it depends on, rather than treating the BA's working assumptions as implicit.</w:t>
       </w:r>
     </w:p>
     <w:p>
@@ -1517,7 +1503,7 @@
         <w:pStyle w:val="ListParagraph"/>
         <w:numPr>
           <w:ilvl w:val="0"/>
-          <w:numId w:val="1"/>
+          <w:numId w:val="2"/>
         </w:numPr>
         <w:spacing w:after="80"/>
       </w:pPr>
@@ -1527,25 +1513,7 @@
           <w:sz w:val="22"/>
           <w:szCs w:val="22"/>
         </w:rPr>
-        <w:t xml:space="preserve">OR-03 (Task Submission content): the wireframe intentionally shows no </w:t>
-      </w:r>
-      <w:proofErr w:type="spellStart"/>
-      <w:r>
-        <w:rPr>
-          <w:rFonts w:ascii="Calibri" w:eastAsia="Calibri" w:hAnsi="Calibri" w:cs="Calibri"/>
-          <w:sz w:val="22"/>
-          <w:szCs w:val="22"/>
-        </w:rPr>
-        <w:t>labeled</w:t>
-      </w:r>
-      <w:proofErr w:type="spellEnd"/>
-      <w:r>
-        <w:rPr>
-          <w:rFonts w:ascii="Calibri" w:eastAsia="Calibri" w:hAnsi="Calibri" w:cs="Calibri"/>
-          <w:sz w:val="22"/>
-          <w:szCs w:val="22"/>
-        </w:rPr>
-        <w:t xml:space="preserve"> fields for this function. This is not an oversight — AC-03.5 specifically instructs against introducing unsupported fields as though confirmed.</w:t>
+        <w:t>OR-03 (Task Submission content): the wireframe shows no labeled fields for this function — confirmed correct by BA review (FR-10, AC-03.5, OR-03; no unsupported mandatory fields to be introduced at this stage).</w:t>
       </w:r>
     </w:p>
     <w:p>
@@ -1553,7 +1521,7 @@
         <w:pStyle w:val="ListParagraph"/>
         <w:numPr>
           <w:ilvl w:val="0"/>
-          <w:numId w:val="1"/>
+          <w:numId w:val="2"/>
         </w:numPr>
         <w:spacing w:after="80"/>
       </w:pPr>
@@ -1563,22 +1531,7 @@
           <w:sz w:val="22"/>
           <w:szCs w:val="22"/>
         </w:rPr>
-        <w:t>Weekly Progress fields: the original BA doc marked Blockers as optional. The Week 2 update (FR-13, WA-06) lists all three fields together as “minimum content” with no field marked optional. This wireframe follows the Week 2 wording literally (all three required) — flagged here as an open question for the BA to confirm whether the optional-Blockers distinction was meant to carry over or was intentionally dropped.</w:t>
-      </w:r>
-    </w:p>
-    <w:p>
-      <w:pPr>
-        <w:pStyle w:val="Heading1"/>
-        <w:spacing w:before="320" w:after="160"/>
-      </w:pPr>
-      <w:r>
-        <w:rPr>
-          <w:rFonts w:ascii="Calibri" w:eastAsia="Calibri" w:hAnsi="Calibri" w:cs="Calibri"/>
-          <w:b/>
-          <w:bCs/>
-          <w:color w:val="1B3A5C"/>
-        </w:rPr>
-        <w:t>7. Explicitly not in this file</w:t>
+        <w:t>Weekly Progress fields: confirmed correct by BA review — Accomplishments, Blockers and Next Steps are all required under the current Week 2 baseline (FR-13, AC-04.2, WA-06). The old doc's “Blockers optional” distinction does not carry over.</w:t>
       </w:r>
     </w:p>
     <w:p>
@@ -1586,7 +1539,7 @@
         <w:pStyle w:val="ListParagraph"/>
         <w:numPr>
           <w:ilvl w:val="0"/>
-          <w:numId w:val="1"/>
+          <w:numId w:val="2"/>
         </w:numPr>
         <w:spacing w:after="80"/>
       </w:pPr>
@@ -1596,8 +1549,36 @@
           <w:sz w:val="22"/>
           <w:szCs w:val="22"/>
         </w:rPr>
+        <w:t>Task status flow (Assigned → In Progress → Completed): confirmed the representation may remain. Skip/reverse/post-completion rules remain unresolved under OR-06 and are not treated as final.</w:t>
+      </w:r>
+    </w:p>
+    <w:p>
+      <w:pPr>
+        <w:pStyle w:val="Heading1"/>
+        <w:spacing w:before="320" w:after="160"/>
+      </w:pPr>
+      <w:r>
+        <w:rPr>
+          <w:rFonts w:ascii="Calibri" w:eastAsia="Calibri" w:hAnsi="Calibri" w:cs="Calibri"/>
+          <w:b/>
+          <w:bCs/>
+          <w:color w:val="1B3A5C"/>
+        </w:rPr>
         <w:lastRenderedPageBreak/>
-        <w:t>Register, Application, Application Status — Team A's scope (BA transition doc, Section 9 ownership table)</w:t>
+        <w:t>6.1 BA review — corrections applied</w:t>
+      </w:r>
+    </w:p>
+    <w:p>
+      <w:pPr>
+        <w:spacing w:after="160"/>
+      </w:pPr>
+      <w:r>
+        <w:rPr>
+          <w:rFonts w:ascii="Calibri" w:eastAsia="Calibri" w:hAnsi="Calibri" w:cs="Calibri"/>
+          <w:sz w:val="22"/>
+          <w:szCs w:val="22"/>
+        </w:rPr>
+        <w:t>Following BA review by Shakthijhaa Sivagnanam, two traceability corrections were identified and applied. No screen-layout changes were required — both were citation fixes.</w:t>
       </w:r>
     </w:p>
     <w:p>
@@ -1605,7 +1586,7 @@
         <w:pStyle w:val="ListParagraph"/>
         <w:numPr>
           <w:ilvl w:val="0"/>
-          <w:numId w:val="1"/>
+          <w:numId w:val="2"/>
         </w:numPr>
         <w:spacing w:after="80"/>
       </w:pPr>
@@ -1615,7 +1596,7 @@
           <w:sz w:val="22"/>
           <w:szCs w:val="22"/>
         </w:rPr>
-        <w:t>Mentor-assignment UI (who becomes whose mentor) — stays outside Core MVP per WA-04</w:t>
+        <w:t>Section 7 (this document) previously cited the transition doc's Section 9 for the Team A/Team B ownership table. Corrected to Section 6 — Section 9 is Client-Supported Decisions, not the ownership boundaries.</w:t>
       </w:r>
     </w:p>
     <w:p>
@@ -1623,7 +1604,7 @@
         <w:pStyle w:val="ListParagraph"/>
         <w:numPr>
           <w:ilvl w:val="0"/>
-          <w:numId w:val="1"/>
+          <w:numId w:val="2"/>
         </w:numPr>
         <w:spacing w:after="80"/>
       </w:pPr>
@@ -1633,7 +1614,7 @@
           <w:sz w:val="22"/>
           <w:szCs w:val="22"/>
         </w:rPr>
-        <w:t>The Applicant-to-Intern transition screen itself — shared touchpoint requiring coordination with Team A UX (Wyatt), not a Team B-only design decision</w:t>
+        <w:t>Sections 2 and 4.6 (this document), and the on-screen annotation on the Assign Task wireframe, previously cited WA-08 for the “no status field” design decision. WA-08 still lists Status as part of minimum Task Assignment information without distinguishing Mentor-entered from system-set fields. Corrected to cite FR-02 (Mentor is not required to manually select initial status) and FR-03 (system sets Assigned automatically) instead — these are the more specific, current source. Per BA feedback, WA-08 itself will be updated in the transition document separately; that update is a BA action, not a UX one.</w:t>
       </w:r>
     </w:p>
     <w:p>
@@ -1648,12 +1629,17 @@
           <w:bCs/>
           <w:color w:val="1B3A5C"/>
         </w:rPr>
-        <w:t>8. Wireframe evidence</w:t>
-      </w:r>
-    </w:p>
-    <w:p>
-      <w:pPr>
-        <w:spacing w:after="160"/>
+        <w:t>7. Explicitly not in this file</w:t>
+      </w:r>
+    </w:p>
+    <w:p>
+      <w:pPr>
+        <w:pStyle w:val="ListParagraph"/>
+        <w:numPr>
+          <w:ilvl w:val="0"/>
+          <w:numId w:val="2"/>
+        </w:numPr>
+        <w:spacing w:after="80"/>
       </w:pPr>
       <w:r>
         <w:rPr>
@@ -1661,62 +1647,201 @@
           <w:sz w:val="22"/>
           <w:szCs w:val="22"/>
         </w:rPr>
-        <w:t xml:space="preserve">Nine screens, built in Figma Make. Insert one screenshot per slot below, matching each screen's frame label exactly — this makes it easy for a reviewer to check the doc against the live file. The interactive parts (the status control </w:t>
-      </w:r>
-      <w:proofErr w:type="gramStart"/>
+        <w:t>Register, Application, Application Status — Team A's scope (BA transition doc, Section 6 ownership table)</w:t>
+      </w:r>
+    </w:p>
+    <w:p>
+      <w:pPr>
+        <w:pStyle w:val="ListParagraph"/>
+        <w:numPr>
+          <w:ilvl w:val="0"/>
+          <w:numId w:val="2"/>
+        </w:numPr>
+        <w:spacing w:after="80"/>
+      </w:pPr>
       <w:r>
         <w:rPr>
           <w:rFonts w:ascii="Calibri" w:eastAsia="Calibri" w:hAnsi="Calibri" w:cs="Calibri"/>
           <w:sz w:val="22"/>
           <w:szCs w:val="22"/>
         </w:rPr>
-        <w:t>actually advancing</w:t>
-      </w:r>
-      <w:proofErr w:type="gramEnd"/>
+        <w:t>Mentor-assignment UI (who becomes whose mentor) — stays outside Core MVP per WA-04</w:t>
+      </w:r>
+    </w:p>
+    <w:p>
+      <w:pPr>
+        <w:pStyle w:val="ListParagraph"/>
+        <w:numPr>
+          <w:ilvl w:val="0"/>
+          <w:numId w:val="2"/>
+        </w:numPr>
+        <w:spacing w:after="80"/>
+      </w:pPr>
       <w:r>
         <w:rPr>
           <w:rFonts w:ascii="Calibri" w:eastAsia="Calibri" w:hAnsi="Calibri" w:cs="Calibri"/>
           <w:sz w:val="22"/>
           <w:szCs w:val="22"/>
         </w:rPr>
-        <w:t xml:space="preserve">, the Task Submission section expanding) won't show in a static image, so a short note is included where </w:t>
-      </w:r>
-      <w:proofErr w:type="gramStart"/>
+        <w:t>The Applicant-to-Intern transition screen itself — shared touchpoint requiring coordination with Team A UX (Wyatt), not a Team B-only design decision</w:t>
+      </w:r>
+    </w:p>
+    <w:p>
+      <w:pPr>
+        <w:pStyle w:val="Heading1"/>
+        <w:spacing w:before="320" w:after="160"/>
+      </w:pPr>
+      <w:r>
+        <w:rPr>
+          <w:rFonts w:ascii="Calibri" w:eastAsia="Calibri" w:hAnsi="Calibri" w:cs="Calibri"/>
+          <w:b/>
+          <w:bCs/>
+          <w:color w:val="1B3A5C"/>
+        </w:rPr>
+        <w:t>8. Wireframe evidence</w:t>
+      </w:r>
+    </w:p>
+    <w:p>
+      <w:pPr>
+        <w:spacing w:after="160"/>
+      </w:pPr>
       <w:r>
         <w:rPr>
           <w:rFonts w:ascii="Calibri" w:eastAsia="Calibri" w:hAnsi="Calibri" w:cs="Calibri"/>
           <w:sz w:val="22"/>
           <w:szCs w:val="22"/>
         </w:rPr>
-        <w:t>that matters</w:t>
-      </w:r>
-      <w:proofErr w:type="gramEnd"/>
-      <w:r>
-        <w:rPr>
-          <w:rFonts w:ascii="Calibri" w:eastAsia="Calibri" w:hAnsi="Calibri" w:cs="Calibri"/>
-          <w:sz w:val="22"/>
-          <w:szCs w:val="22"/>
-        </w:rPr>
-        <w:t>.</w:t>
-      </w:r>
-    </w:p>
-    <w:p>
-      <w:pPr>
-        <w:spacing w:before="200" w:after="60"/>
-        <w:rPr>
-          <w:rFonts w:ascii="Calibri" w:eastAsia="Calibri" w:hAnsi="Calibri" w:cs="Calibri"/>
-          <w:b/>
-          <w:bCs/>
-          <w:color w:val="1B3A5C"/>
-        </w:rPr>
-      </w:pPr>
-      <w:r>
-        <w:rPr>
-          <w:rFonts w:ascii="Calibri" w:eastAsia="Calibri" w:hAnsi="Calibri" w:cs="Calibri"/>
-          <w:b/>
-          <w:bCs/>
-          <w:color w:val="1B3A5C"/>
-        </w:rPr>
+        <w:t>Nine screens, built in Figma Make. Insert one screenshot per slot below, matching each screen's frame label exactly — this makes it easy for a reviewer to check the doc against the live file. The interactive parts (the status control actually advancing, the Task Submission section expanding) won't show in a static image, so a short note is included where that matters.</w:t>
+      </w:r>
+    </w:p>
+    <w:p>
+      <w:pPr>
+        <w:spacing w:before="200" w:after="60"/>
+        <w:rPr>
+          <w:rFonts w:ascii="Calibri" w:eastAsia="Calibri" w:hAnsi="Calibri" w:cs="Calibri"/>
+          <w:b/>
+          <w:bCs/>
+          <w:color w:val="1B3A5C"/>
+        </w:rPr>
+      </w:pPr>
+    </w:p>
+    <w:p>
+      <w:pPr>
+        <w:spacing w:before="200" w:after="60"/>
+        <w:rPr>
+          <w:rFonts w:ascii="Calibri" w:eastAsia="Calibri" w:hAnsi="Calibri" w:cs="Calibri"/>
+          <w:b/>
+          <w:bCs/>
+          <w:color w:val="1B3A5C"/>
+        </w:rPr>
+      </w:pPr>
+    </w:p>
+    <w:p>
+      <w:pPr>
+        <w:spacing w:before="200" w:after="60"/>
+        <w:rPr>
+          <w:rFonts w:ascii="Calibri" w:eastAsia="Calibri" w:hAnsi="Calibri" w:cs="Calibri"/>
+          <w:b/>
+          <w:bCs/>
+          <w:color w:val="1B3A5C"/>
+        </w:rPr>
+      </w:pPr>
+    </w:p>
+    <w:p>
+      <w:pPr>
+        <w:spacing w:before="200" w:after="60"/>
+        <w:rPr>
+          <w:rFonts w:ascii="Calibri" w:eastAsia="Calibri" w:hAnsi="Calibri" w:cs="Calibri"/>
+          <w:b/>
+          <w:bCs/>
+          <w:color w:val="1B3A5C"/>
+        </w:rPr>
+      </w:pPr>
+    </w:p>
+    <w:p>
+      <w:pPr>
+        <w:spacing w:before="200" w:after="60"/>
+        <w:rPr>
+          <w:rFonts w:ascii="Calibri" w:eastAsia="Calibri" w:hAnsi="Calibri" w:cs="Calibri"/>
+          <w:b/>
+          <w:bCs/>
+          <w:color w:val="1B3A5C"/>
+        </w:rPr>
+      </w:pPr>
+    </w:p>
+    <w:p>
+      <w:pPr>
+        <w:spacing w:before="200" w:after="60"/>
+        <w:rPr>
+          <w:rFonts w:ascii="Calibri" w:eastAsia="Calibri" w:hAnsi="Calibri" w:cs="Calibri"/>
+          <w:b/>
+          <w:bCs/>
+          <w:color w:val="1B3A5C"/>
+        </w:rPr>
+      </w:pPr>
+    </w:p>
+    <w:p>
+      <w:pPr>
+        <w:spacing w:before="200" w:after="60"/>
+        <w:rPr>
+          <w:rFonts w:ascii="Calibri" w:eastAsia="Calibri" w:hAnsi="Calibri" w:cs="Calibri"/>
+          <w:b/>
+          <w:bCs/>
+          <w:color w:val="1B3A5C"/>
+        </w:rPr>
+      </w:pPr>
+    </w:p>
+    <w:p>
+      <w:pPr>
+        <w:spacing w:before="200" w:after="60"/>
+        <w:rPr>
+          <w:rFonts w:ascii="Calibri" w:eastAsia="Calibri" w:hAnsi="Calibri" w:cs="Calibri"/>
+          <w:b/>
+          <w:bCs/>
+          <w:color w:val="1B3A5C"/>
+        </w:rPr>
+      </w:pPr>
+    </w:p>
+    <w:p>
+      <w:pPr>
+        <w:spacing w:before="200" w:after="60"/>
+        <w:rPr>
+          <w:rFonts w:ascii="Calibri" w:eastAsia="Calibri" w:hAnsi="Calibri" w:cs="Calibri"/>
+          <w:b/>
+          <w:bCs/>
+          <w:color w:val="1B3A5C"/>
+        </w:rPr>
+      </w:pPr>
+    </w:p>
+    <w:p>
+      <w:pPr>
+        <w:spacing w:before="200" w:after="60"/>
+        <w:rPr>
+          <w:rFonts w:ascii="Calibri" w:eastAsia="Calibri" w:hAnsi="Calibri" w:cs="Calibri"/>
+          <w:b/>
+          <w:bCs/>
+          <w:color w:val="1B3A5C"/>
+        </w:rPr>
+      </w:pPr>
+    </w:p>
+    <w:p>
+      <w:pPr>
+        <w:spacing w:before="200" w:after="60"/>
+        <w:rPr>
+          <w:rFonts w:ascii="Calibri" w:eastAsia="Calibri" w:hAnsi="Calibri" w:cs="Calibri"/>
+          <w:b/>
+          <w:bCs/>
+          <w:color w:val="1B3A5C"/>
+        </w:rPr>
+      </w:pPr>
+      <w:r>
+        <w:rPr>
+          <w:rFonts w:ascii="Calibri" w:eastAsia="Calibri" w:hAnsi="Calibri" w:cs="Calibri"/>
+          <w:b/>
+          <w:bCs/>
+          <w:color w:val="1B3A5C"/>
+        </w:rPr>
+        <w:lastRenderedPageBreak/>
         <w:t>Figure 1 — Intern Workspace</w:t>
       </w:r>
     </w:p>
@@ -1725,6 +1850,9 @@
         <w:spacing w:before="200" w:after="60"/>
       </w:pPr>
       <w:r>
+        <w:rPr>
+          <w:noProof/>
+        </w:rPr>
         <w:drawing>
           <wp:inline distT="0" distB="0" distL="0" distR="0" wp14:anchorId="3770628D" wp14:editId="263C44BD">
             <wp:extent cx="5943600" cy="2710180"/>
@@ -1882,6 +2010,94 @@
           <w:color w:val="1B3A5C"/>
         </w:rPr>
       </w:pPr>
+    </w:p>
+    <w:p>
+      <w:pPr>
+        <w:spacing w:before="200" w:after="60"/>
+        <w:rPr>
+          <w:rFonts w:ascii="Calibri" w:eastAsia="Calibri" w:hAnsi="Calibri" w:cs="Calibri"/>
+          <w:b/>
+          <w:bCs/>
+          <w:color w:val="1B3A5C"/>
+        </w:rPr>
+      </w:pPr>
+    </w:p>
+    <w:p>
+      <w:pPr>
+        <w:spacing w:before="200" w:after="60"/>
+        <w:rPr>
+          <w:rFonts w:ascii="Calibri" w:eastAsia="Calibri" w:hAnsi="Calibri" w:cs="Calibri"/>
+          <w:b/>
+          <w:bCs/>
+          <w:color w:val="1B3A5C"/>
+        </w:rPr>
+      </w:pPr>
+    </w:p>
+    <w:p>
+      <w:pPr>
+        <w:spacing w:before="200" w:after="60"/>
+        <w:rPr>
+          <w:rFonts w:ascii="Calibri" w:eastAsia="Calibri" w:hAnsi="Calibri" w:cs="Calibri"/>
+          <w:b/>
+          <w:bCs/>
+          <w:color w:val="1B3A5C"/>
+        </w:rPr>
+      </w:pPr>
+    </w:p>
+    <w:p>
+      <w:pPr>
+        <w:spacing w:before="200" w:after="60"/>
+        <w:rPr>
+          <w:rFonts w:ascii="Calibri" w:eastAsia="Calibri" w:hAnsi="Calibri" w:cs="Calibri"/>
+          <w:b/>
+          <w:bCs/>
+          <w:color w:val="1B3A5C"/>
+        </w:rPr>
+      </w:pPr>
+    </w:p>
+    <w:p>
+      <w:pPr>
+        <w:spacing w:before="200" w:after="60"/>
+        <w:rPr>
+          <w:rFonts w:ascii="Calibri" w:eastAsia="Calibri" w:hAnsi="Calibri" w:cs="Calibri"/>
+          <w:b/>
+          <w:bCs/>
+          <w:color w:val="1B3A5C"/>
+        </w:rPr>
+      </w:pPr>
+    </w:p>
+    <w:p>
+      <w:pPr>
+        <w:spacing w:before="200" w:after="60"/>
+        <w:rPr>
+          <w:rFonts w:ascii="Calibri" w:eastAsia="Calibri" w:hAnsi="Calibri" w:cs="Calibri"/>
+          <w:b/>
+          <w:bCs/>
+          <w:color w:val="1B3A5C"/>
+        </w:rPr>
+      </w:pPr>
+    </w:p>
+    <w:p>
+      <w:pPr>
+        <w:spacing w:before="200" w:after="60"/>
+        <w:rPr>
+          <w:rFonts w:ascii="Calibri" w:eastAsia="Calibri" w:hAnsi="Calibri" w:cs="Calibri"/>
+          <w:b/>
+          <w:bCs/>
+          <w:color w:val="1B3A5C"/>
+        </w:rPr>
+      </w:pPr>
+    </w:p>
+    <w:p>
+      <w:pPr>
+        <w:spacing w:before="200" w:after="60"/>
+        <w:rPr>
+          <w:rFonts w:ascii="Calibri" w:eastAsia="Calibri" w:hAnsi="Calibri" w:cs="Calibri"/>
+          <w:b/>
+          <w:bCs/>
+          <w:color w:val="1B3A5C"/>
+        </w:rPr>
+      </w:pPr>
       <w:r>
         <w:rPr>
           <w:rFonts w:ascii="Calibri" w:eastAsia="Calibri" w:hAnsi="Calibri" w:cs="Calibri"/>
@@ -1898,6 +2114,9 @@
         <w:spacing w:before="200" w:after="60"/>
       </w:pPr>
       <w:r>
+        <w:rPr>
+          <w:noProof/>
+        </w:rPr>
         <w:drawing>
           <wp:inline distT="0" distB="0" distL="0" distR="0" wp14:anchorId="29ACF7CB" wp14:editId="0959D9BE">
             <wp:extent cx="5943600" cy="2916555"/>
@@ -1960,6 +2179,9 @@
         <w:spacing w:before="200" w:after="60"/>
       </w:pPr>
       <w:r>
+        <w:rPr>
+          <w:noProof/>
+        </w:rPr>
         <w:drawing>
           <wp:inline distT="0" distB="0" distL="0" distR="0" wp14:anchorId="664A91F9" wp14:editId="3148B07F">
             <wp:extent cx="5943600" cy="3129280"/>
@@ -2062,24 +2284,14 @@
           <w:color w:val="1B3A5C"/>
         </w:rPr>
       </w:pPr>
-    </w:p>
-    <w:p>
-      <w:pPr>
-        <w:spacing w:before="200" w:after="60"/>
-        <w:rPr>
-          <w:rFonts w:ascii="Calibri" w:eastAsia="Calibri" w:hAnsi="Calibri" w:cs="Calibri"/>
-          <w:b/>
-          <w:bCs/>
-          <w:color w:val="1B3A5C"/>
-        </w:rPr>
-      </w:pPr>
-      <w:r>
-        <w:rPr>
-          <w:rFonts w:ascii="Calibri" w:eastAsia="Calibri" w:hAnsi="Calibri" w:cs="Calibri"/>
-          <w:b/>
-          <w:bCs/>
-          <w:color w:val="1B3A5C"/>
-        </w:rPr>
+      <w:r>
+        <w:rPr>
+          <w:rFonts w:ascii="Calibri" w:eastAsia="Calibri" w:hAnsi="Calibri" w:cs="Calibri"/>
+          <w:b/>
+          <w:bCs/>
+          <w:color w:val="1B3A5C"/>
+        </w:rPr>
+        <w:lastRenderedPageBreak/>
         <w:t>Figure 4 — Task Detail</w:t>
       </w:r>
     </w:p>
@@ -2088,6 +2300,9 @@
         <w:spacing w:before="200" w:after="60"/>
       </w:pPr>
       <w:r>
+        <w:rPr>
+          <w:noProof/>
+        </w:rPr>
         <w:drawing>
           <wp:inline distT="0" distB="0" distL="0" distR="0" wp14:anchorId="75986DF7" wp14:editId="5B7B06C7">
             <wp:extent cx="4718230" cy="3514476"/>
@@ -2130,6 +2345,9 @@
         <w:spacing w:before="200" w:after="60"/>
       </w:pPr>
       <w:r>
+        <w:rPr>
+          <w:noProof/>
+        </w:rPr>
         <w:drawing>
           <wp:inline distT="0" distB="0" distL="0" distR="0" wp14:anchorId="59D7E522" wp14:editId="185B62AC">
             <wp:extent cx="4746929" cy="3553603"/>
@@ -2172,6 +2390,9 @@
         <w:spacing w:before="200" w:after="60"/>
       </w:pPr>
       <w:r>
+        <w:rPr>
+          <w:noProof/>
+        </w:rPr>
         <w:lastRenderedPageBreak/>
         <w:drawing>
           <wp:inline distT="0" distB="0" distL="0" distR="0" wp14:anchorId="20FE9422" wp14:editId="0F471F35">
@@ -2379,6 +2600,9 @@
         <w:spacing w:before="200" w:after="60"/>
       </w:pPr>
       <w:r>
+        <w:rPr>
+          <w:noProof/>
+        </w:rPr>
         <w:drawing>
           <wp:inline distT="0" distB="0" distL="0" distR="0" wp14:anchorId="3885B855" wp14:editId="23F0B6B3">
             <wp:extent cx="5943600" cy="5412105"/>
@@ -2541,10 +2765,10 @@
       </w:pPr>
       <w:r>
         <w:drawing>
-          <wp:inline distT="0" distB="0" distL="0" distR="0" wp14:anchorId="0F4E34B5" wp14:editId="384814C8">
-            <wp:extent cx="5943600" cy="5215255"/>
-            <wp:effectExtent l="0" t="0" r="0" b="4445"/>
-            <wp:docPr id="788909376" name="Picture 1"/>
+          <wp:inline distT="0" distB="0" distL="0" distR="0" wp14:anchorId="6845B976" wp14:editId="14233053">
+            <wp:extent cx="5943600" cy="5370195"/>
+            <wp:effectExtent l="0" t="0" r="0" b="1905"/>
+            <wp:docPr id="1794028954" name="Picture 1"/>
             <wp:cNvGraphicFramePr>
               <a:graphicFrameLocks xmlns:a="http://schemas.openxmlformats.org/drawingml/2006/main" noChangeAspect="1"/>
             </wp:cNvGraphicFramePr>
@@ -2552,7 +2776,7 @@
               <a:graphicData uri="http://schemas.openxmlformats.org/drawingml/2006/picture">
                 <pic:pic xmlns:pic="http://schemas.openxmlformats.org/drawingml/2006/picture">
                   <pic:nvPicPr>
-                    <pic:cNvPr id="788909376" name=""/>
+                    <pic:cNvPr id="1794028954" name=""/>
                     <pic:cNvPicPr/>
                   </pic:nvPicPr>
                   <pic:blipFill>
@@ -2564,7 +2788,7 @@
                   <pic:spPr>
                     <a:xfrm>
                       <a:off x="0" y="0"/>
-                      <a:ext cx="5943600" cy="5215255"/>
+                      <a:ext cx="5943600" cy="5370195"/>
                     </a:xfrm>
                     <a:prstGeom prst="rect">
                       <a:avLst/>
@@ -2691,6 +2915,9 @@
         <w:spacing w:before="200" w:after="60"/>
       </w:pPr>
       <w:r>
+        <w:rPr>
+          <w:noProof/>
+        </w:rPr>
         <w:drawing>
           <wp:inline distT="0" distB="0" distL="0" distR="0" wp14:anchorId="3E9A5B20" wp14:editId="659474A5">
             <wp:extent cx="5943600" cy="2918460"/>
@@ -2753,6 +2980,9 @@
         <w:spacing w:before="200" w:after="60"/>
       </w:pPr>
       <w:r>
+        <w:rPr>
+          <w:noProof/>
+        </w:rPr>
         <w:drawing>
           <wp:inline distT="0" distB="0" distL="0" distR="0" wp14:anchorId="19BFD770" wp14:editId="6D6CDCF0">
             <wp:extent cx="5943600" cy="3353435"/>
@@ -2860,6 +3090,9 @@
         <w:spacing w:before="200" w:after="60"/>
       </w:pPr>
       <w:r>
+        <w:rPr>
+          <w:noProof/>
+        </w:rPr>
         <w:drawing>
           <wp:inline distT="0" distB="0" distL="0" distR="0" wp14:anchorId="511C700E" wp14:editId="727F58EB">
             <wp:extent cx="5943600" cy="1788160"/>
@@ -2910,6 +3143,92 @@
 <file path=word/numbering.xml><?xml version="1.0" encoding="utf-8"?>
 <w:numbering xmlns:wpc="http://schemas.microsoft.com/office/word/2010/wordprocessingCanvas" xmlns:cx="http://schemas.microsoft.com/office/drawing/2014/chartex" xmlns:cx1="http://schemas.microsoft.com/office/drawing/2015/9/8/chartex" xmlns:cx2="http://schemas.microsoft.com/office/drawing/2015/10/21/chartex" xmlns:cx3="http://schemas.microsoft.com/office/drawing/2016/5/9/chartex" xmlns:cx4="http://schemas.microsoft.com/office/drawing/2016/5/10/chartex" xmlns:cx5="http://schemas.microsoft.com/office/drawing/2016/5/11/chartex" xmlns:cx6="http://schemas.microsoft.com/office/drawing/2016/5/12/chartex" xmlns:cx7="http://schemas.microsoft.com/office/drawing/2016/5/13/chartex" xmlns:cx8="http://schemas.microsoft.com/office/drawing/2016/5/14/chartex" xmlns:mc="http://schemas.openxmlformats.org/markup-compatibility/2006" xmlns:aink="http://schemas.microsoft.com/office/drawing/2016/ink" xmlns:am3d="http://schemas.microsoft.com/office/drawing/2017/model3d" xmlns:o="urn:schemas-microsoft-com:office:office" xmlns:oel="http://schemas.microsoft.com/office/2019/extlst" xmlns:r="http://schemas.openxmlformats.org/officeDocument/2006/relationships" xmlns:m="http://schemas.openxmlformats.org/officeDocument/2006/math" xmlns:v="urn:schemas-microsoft-com:vml" xmlns:wp14="http://schemas.microsoft.com/office/word/2010/wordprocessingDrawing" xmlns:wp="http://schemas.openxmlformats.org/drawingml/2006/wordprocessingDrawing" xmlns:w10="urn:schemas-microsoft-com:office:word" xmlns:w="http://schemas.openxmlformats.org/wordprocessingml/2006/main" xmlns:w14="http://schemas.microsoft.com/office/word/2010/wordml" xmlns:w15="http://schemas.microsoft.com/office/word/2012/wordml" xmlns:w16cex="http://schemas.microsoft.com/office/word/2018/wordml/cex" xmlns:w16cid="http://schemas.microsoft.com/office/word/2016/wordml/cid" xmlns:w16="http://schemas.microsoft.com/office/word/2018/wordml" xmlns:w16du="http://schemas.microsoft.com/office/word/2023/wordml/word16du" xmlns:w16sdtdh="http://schemas.microsoft.com/office/word/2020/wordml/sdtdatahash" xmlns:w16sdtfl="http://schemas.microsoft.com/office/word/2024/wordml/sdtformatlock" xmlns:w16se="http://schemas.microsoft.com/office/word/2015/wordml/symex" xmlns:wpg="http://schemas.microsoft.com/office/word/2010/wordprocessingGroup" xmlns:wpi="http://schemas.microsoft.com/office/word/2010/wordprocessingInk" xmlns:wne="http://schemas.microsoft.com/office/word/2006/wordml" xmlns:wps="http://schemas.microsoft.com/office/word/2010/wordprocessingShape" mc:Ignorable="w14 w15 w16se w16cid w16 w16cex w16sdtdh w16sdtfl w16du wp14">
   <w:abstractNum w:abstractNumId="0" w15:restartNumberingAfterBreak="0">
+    <w:nsid w:val="381962FA"/>
+    <w:multiLevelType w:val="hybridMultilevel"/>
+    <w:tmpl w:val="9DFA1104"/>
+    <w:lvl w:ilvl="0" w:tplc="22347A7C">
+      <w:start w:val="1"/>
+      <w:numFmt w:val="bullet"/>
+      <w:lvlText w:val="●"/>
+      <w:lvlJc w:val="left"/>
+      <w:pPr>
+        <w:ind w:left="720" w:hanging="360"/>
+      </w:pPr>
+    </w:lvl>
+    <w:lvl w:ilvl="1" w:tplc="53762AF4">
+      <w:start w:val="1"/>
+      <w:numFmt w:val="bullet"/>
+      <w:lvlText w:val="○"/>
+      <w:lvlJc w:val="left"/>
+      <w:pPr>
+        <w:ind w:left="1440" w:hanging="360"/>
+      </w:pPr>
+    </w:lvl>
+    <w:lvl w:ilvl="2" w:tplc="4F6C632A">
+      <w:start w:val="1"/>
+      <w:numFmt w:val="bullet"/>
+      <w:lvlText w:val="■"/>
+      <w:lvlJc w:val="left"/>
+      <w:pPr>
+        <w:ind w:left="2160" w:hanging="360"/>
+      </w:pPr>
+    </w:lvl>
+    <w:lvl w:ilvl="3" w:tplc="AFF82EF0">
+      <w:start w:val="1"/>
+      <w:numFmt w:val="bullet"/>
+      <w:lvlText w:val="●"/>
+      <w:lvlJc w:val="left"/>
+      <w:pPr>
+        <w:ind w:left="2880" w:hanging="360"/>
+      </w:pPr>
+    </w:lvl>
+    <w:lvl w:ilvl="4" w:tplc="F72CE764">
+      <w:start w:val="1"/>
+      <w:numFmt w:val="bullet"/>
+      <w:lvlText w:val="○"/>
+      <w:lvlJc w:val="left"/>
+      <w:pPr>
+        <w:ind w:left="3600" w:hanging="360"/>
+      </w:pPr>
+    </w:lvl>
+    <w:lvl w:ilvl="5" w:tplc="7A207D08">
+      <w:start w:val="1"/>
+      <w:numFmt w:val="bullet"/>
+      <w:lvlText w:val="■"/>
+      <w:lvlJc w:val="left"/>
+      <w:pPr>
+        <w:ind w:left="4320" w:hanging="360"/>
+      </w:pPr>
+    </w:lvl>
+    <w:lvl w:ilvl="6" w:tplc="0B82D54E">
+      <w:start w:val="1"/>
+      <w:numFmt w:val="bullet"/>
+      <w:lvlText w:val="●"/>
+      <w:lvlJc w:val="left"/>
+      <w:pPr>
+        <w:ind w:left="5040" w:hanging="360"/>
+      </w:pPr>
+    </w:lvl>
+    <w:lvl w:ilvl="7" w:tplc="C0AE55FE">
+      <w:start w:val="1"/>
+      <w:numFmt w:val="bullet"/>
+      <w:lvlText w:val="●"/>
+      <w:lvlJc w:val="left"/>
+      <w:pPr>
+        <w:ind w:left="5760" w:hanging="360"/>
+      </w:pPr>
+    </w:lvl>
+    <w:lvl w:ilvl="8" w:tplc="77464866">
+      <w:start w:val="1"/>
+      <w:numFmt w:val="bullet"/>
+      <w:lvlText w:val="●"/>
+      <w:lvlJc w:val="left"/>
+      <w:pPr>
+        <w:ind w:left="6480" w:hanging="360"/>
+      </w:pPr>
+    </w:lvl>
+  </w:abstractNum>
+  <w:abstractNum w:abstractNumId="1" w15:restartNumberingAfterBreak="0">
     <w:nsid w:val="4686457C"/>
     <w:multiLevelType w:val="hybridMultilevel"/>
     <w:tmpl w:val="E9C6E058"/>
@@ -2996,6 +3315,12 @@
     </w:lvl>
   </w:abstractNum>
   <w:num w:numId="1" w16cid:durableId="1991052265">
+    <w:abstractNumId w:val="1"/>
+    <w:lvlOverride w:ilvl="0">
+      <w:startOverride w:val="1"/>
+    </w:lvlOverride>
+  </w:num>
+  <w:num w:numId="2" w16cid:durableId="1141771535">
     <w:abstractNumId w:val="0"/>
     <w:lvlOverride w:ilvl="0">
       <w:startOverride w:val="1"/>
@@ -3399,6 +3724,7 @@
   </w:style>
   <w:style w:type="paragraph" w:styleId="Heading1">
     <w:name w:val="heading 1"/>
+    <w:link w:val="Heading1Char"/>
     <w:uiPriority w:val="9"/>
     <w:qFormat/>
     <w:pPr>
@@ -3412,6 +3738,7 @@
   </w:style>
   <w:style w:type="paragraph" w:styleId="Heading2">
     <w:name w:val="heading 2"/>
+    <w:link w:val="Heading2Char"/>
     <w:uiPriority w:val="9"/>
     <w:unhideWhenUsed/>
     <w:qFormat/>
@@ -3589,6 +3916,30 @@
     <w:rPr>
       <w:sz w:val="20"/>
       <w:szCs w:val="20"/>
+    </w:rPr>
+  </w:style>
+  <w:style w:type="character" w:customStyle="1" w:styleId="Heading1Char">
+    <w:name w:val="Heading 1 Char"/>
+    <w:basedOn w:val="DefaultParagraphFont"/>
+    <w:link w:val="Heading1"/>
+    <w:uiPriority w:val="9"/>
+    <w:rsid w:val="00EB1FDE"/>
+    <w:rPr>
+      <w:color w:val="2E74B5"/>
+      <w:sz w:val="32"/>
+      <w:szCs w:val="32"/>
+    </w:rPr>
+  </w:style>
+  <w:style w:type="character" w:customStyle="1" w:styleId="Heading2Char">
+    <w:name w:val="Heading 2 Char"/>
+    <w:basedOn w:val="DefaultParagraphFont"/>
+    <w:link w:val="Heading2"/>
+    <w:uiPriority w:val="9"/>
+    <w:rsid w:val="00EB1FDE"/>
+    <w:rPr>
+      <w:color w:val="2E74B5"/>
+      <w:sz w:val="26"/>
+      <w:szCs w:val="26"/>
     </w:rPr>
   </w:style>
 </w:styles>

</xml_diff>